<commit_message>
Research: content plans for Troubleshooting and Configuration Comparison
Co-Authored-By: Claude Opus 5.5 <noreply@anthropic.com>
Claude-Session: https://claude.ai/code/session_01AnNjVdUt7zLue4GreZ19rC
</commit_message>
<xml_diff>
--- a/TOC-output/Troubleshooting Automation with Claude/Research/Troubleshooting Automation with Claude - Research and Content Plan.docx
+++ b/TOC-output/Troubleshooting Automation with Claude/Research/Troubleshooting Automation with Claude - Research and Content Plan.docx
@@ -5956,6 +5956,14 @@
     </w:p>
     <w:p>
       <w:pPr>
+        <w:pStyle w:val="ListBullet"/>
+      </w:pPr>
+      <w:r>
+        <w:t>If the PATCH fails validation (for example a mandatory close field), surface the instance error to the engineer instead of retrying with guessed values [1].</w:t>
+      </w:r>
+    </w:p>
+    <w:p>
+      <w:pPr>
         <w:pStyle w:val="Heading4"/>
       </w:pPr>
       <w:r>
@@ -7020,6 +7028,22 @@
     </w:p>
     <w:p>
       <w:pPr>
+        <w:pStyle w:val="ListBullet"/>
+      </w:pPr>
+      <w:r>
+        <w:t>The capstone incident deliberately omits two checklist details so the acknowledgement step is exercised.</w:t>
+      </w:r>
+    </w:p>
+    <w:p>
+      <w:pPr>
+        <w:pStyle w:val="ListBullet"/>
+      </w:pPr>
+      <w:r>
+        <w:t>Teams must use only the collectors and allowlist built during the course; no ad hoc device logins.</w:t>
+      </w:r>
+    </w:p>
+    <w:p>
+      <w:pPr>
         <w:pStyle w:val="Heading4"/>
       </w:pPr>
       <w:r>
@@ -7088,6 +7112,14 @@
       </w:pPr>
       <w:r>
         <w:t>Next steps for production: credentials, change control, rollout.</w:t>
+      </w:r>
+    </w:p>
+    <w:p>
+      <w:pPr>
+        <w:pStyle w:val="ListBullet"/>
+      </w:pPr>
+      <w:r>
+        <w:t>Show the audit log and the matching approval records during the demo, not only the final note.</w:t>
       </w:r>
     </w:p>
     <w:p>

</xml_diff>